<commit_message>
Update Test Strategy and Test Scenarios documents
</commit_message>
<xml_diff>
--- a/QA/02-Test-Planning/Test_Strategy.docx
+++ b/QA/02-Test-Planning/Test_Strategy.docx
@@ -1242,6 +1242,21 @@
     </w:p>
     <w:p>
       <w:pPr>
+        <w:pStyle w:val="ListParagraph"/>
+        <w:numPr>
+          <w:ilvl w:val="0"/>
+          <w:numId w:val="3"/>
+        </w:numPr>
+        <w:rPr>
+          <w:rFonts w:eastAsia="Arial"/>
+        </w:rPr>
+      </w:pPr>
+      <w:r>
+        <w:t>Selenium UI tests additionally require the frontend to be running locally at http://localhost:5173 and a pre-existing test user account (registered via the application) with known credentials. Tests run against Chrome via ChromeDriver, in headless mode by default.</w:t>
+      </w:r>
+    </w:p>
+    <w:p>
+      <w:pPr>
         <w:pStyle w:val="Heading1"/>
         <w:rPr>
           <w:rFonts w:eastAsia="Arial"/>
@@ -1567,6 +1582,21 @@
       </w:pPr>
       <w:r>
         <w:t>dotnet test – for backend unit tests; Bruno – for API regression tests.</w:t>
+      </w:r>
+    </w:p>
+    <w:p>
+      <w:pPr>
+        <w:pStyle w:val="ListParagraph"/>
+        <w:numPr>
+          <w:ilvl w:val="0"/>
+          <w:numId w:val="9"/>
+        </w:numPr>
+        <w:rPr>
+          <w:rFonts w:eastAsia="Arial"/>
+        </w:rPr>
+      </w:pPr>
+      <w:r>
+        <w:t>Maven (mvn test) – for building and running the Selenium UI test suite.</w:t>
       </w:r>
     </w:p>
     <w:p>

</xml_diff>